<commit_message>
docs: overhaul presentation deck text to be natural, human-styled, and speak-oriented for ideathon submission
</commit_message>
<xml_diff>
--- a/PRESENTATION_DECK.docx
+++ b/PRESENTATION_DECK.docx
@@ -55,7 +55,7 @@
           <w:i/>
           <w:color w:val="64748B"/>
         </w:rPr>
-        <w:t>**Disaster Command Center &amp; Predictive Hydrological Emergency Dispatch Portal**</w:t>
+        <w:t>**Disaster Command Center &amp; Predictive Hydrological Emergency Portal**</w:t>
       </w:r>
     </w:p>
     <w:p>
@@ -94,7 +94,7 @@
           <w:i/>
           <w:color w:val="64748B"/>
         </w:rPr>
-        <w:t>**Live Production Link:** [https://pratyush-two.vercel.app](https://pratyush-two.vercel.app)</w:t>
+        <w:t>**Live Portal:** [https://pratyush-two.vercel.app](https://pratyush-two.vercel.app)</w:t>
       </w:r>
     </w:p>
     <w:p>
@@ -107,7 +107,7 @@
           <w:i/>
           <w:color w:val="64748B"/>
         </w:rPr>
-        <w:t>**GitHub Repository:** [https://github.com/PratyushPandey31/Hackthon-4.git](https://github.com/PratyushPandey31/Hackthon-4.git)</w:t>
+        <w:t>**GitHub:** [https://github.com/PratyushPandey31/Hackthon-4.git](https://github.com/PratyushPandey31/Hackthon-4.git)</w:t>
       </w:r>
     </w:p>
     <w:p>
@@ -130,7 +130,7 @@
           <w:color w:val="0F172A"/>
           <w:sz w:val="36"/>
         </w:rPr>
-        <w:t>📌 QUICK OVERVIEW: KYU, NEED, KYA, KYA KARTA HAI, &amp; SOLVE</w:t>
+        <w:t>📌 PROJECT AT A GLANCE: THE FIVE CORE ANSWERS</w:t>
       </w:r>
     </w:p>
     <w:p>
@@ -143,23 +143,12 @@
           <w:color w:val="0E7490"/>
           <w:sz w:val="26"/>
         </w:rPr>
-        <w:t>1. KYU BNAYA HAI? (Why we built it)</w:t>
+        <w:t>1. KYU BNAYA HAI? (Why we built this)</w:t>
       </w:r>
     </w:p>
     <w:p>
-      <w:pPr>
-        <w:pStyle w:val="ListBullet"/>
-      </w:pPr>
       <w:r>
-        <w:t>**Mumbai Monsoon Vulnerability:** Every year, Mumbai experiences extreme downpours exceeding 300mm/day combined with high tide ocean surges. This combination paralyzes transit networks and floods low-lying slums.</w:t>
-      </w:r>
-    </w:p>
-    <w:p>
-      <w:pPr>
-        <w:pStyle w:val="ListBullet"/>
-      </w:pPr>
-      <w:r>
-        <w:t>**Isolated Telemetry Systems:** Current disaster response is **reactive**. BMC weather gauges, Central Railway track logs, and rescue boat coordinates are managed by separate teams on disconnected servers. Help is dispatched too late, after roads and rails are already submerged.</w:t>
+        <w:t>Every monsoon, Mumbai is hit by extreme downpours combined with high-tide ocean surges. This combination drowns low-lying subways, shuts down local train lines, and floods slum areas. Currently, disaster response is reactive. Government teams, railways, and local NGOs operate in separate silos without sharing data. We built this to bridge those gaps and save lives.</w:t>
       </w:r>
     </w:p>
     <w:p>
@@ -176,19 +165,8 @@
       </w:r>
     </w:p>
     <w:p>
-      <w:pPr>
-        <w:pStyle w:val="ListBullet"/>
-      </w:pPr>
       <w:r>
-        <w:t>**Disaster Communication Link:** There was an urgent need for a **Unified Data Ingestion &amp; Emergency Dispatch Center** that operates completely offline (without heavy internet tile-servers), parses raw citizen text messages (from WhatsApp/SMS), and coordinates preemptive evacuation logistics.</w:t>
-      </w:r>
-    </w:p>
-    <w:p>
-      <w:pPr>
-        <w:pStyle w:val="ListBullet"/>
-      </w:pPr>
-      <w:r>
-        <w:t>**Eliminating Latency:** Standard rescue dispatch latency is **3.5 hours**. We needed to reduce this delay to **5 minutes** to evacuate vulnerable populations before high tides lock municipal drainage channels.</w:t>
+        <w:t>We needed a unified command center that gathers fragmented weather sensors, railway status updates, and volunteer rescue chat files into one screen. Standard rescue dispatch takes over 3 hours because of coordination delays. We needed to cut this delay down to under 5 minutes to rescue stranded citizens before the tide rises and subways flood.</w:t>
       </w:r>
     </w:p>
     <w:p>
@@ -205,19 +183,8 @@
       </w:r>
     </w:p>
     <w:p>
-      <w:pPr>
-        <w:pStyle w:val="ListBullet"/>
-      </w:pPr>
       <w:r>
-        <w:t>**A Resilient Command Portal:** An offline-first, glassmorphic emergency command web portal built using React 19, TypeScript 5.7, and native SVG vector graphics.</w:t>
-      </w:r>
-    </w:p>
-    <w:p>
-      <w:pPr>
-        <w:pStyle w:val="ListBullet"/>
-      </w:pPr>
-      <w:r>
-        <w:t>**Role-Based Command Center:** Operates on strict clearance boundaries. Standard analysts have read-only monitoring access, while administrative commanders have full access to dispatch boats, merge queues, and declare state-of-emergencies.</w:t>
+        <w:t>FloodPulse Mumbai is a lightweight, offline-resilient emergency portal built using React 19, TypeScript, and native SVG graphics. It runs strictly on two levels: Standard Analyst (read-only monitoring view) and Admin Commander (full control to tweak simulator variables, run the NLP unifier, and dispatch rescue vessels).</w:t>
       </w:r>
     </w:p>
     <w:p>
@@ -238,7 +205,7 @@
         <w:pStyle w:val="ListBullet"/>
       </w:pPr>
       <w:r>
-        <w:t>**Live Inundation Mapping:** Visualizes municipal sub-wards (Kurla, Dharavi) as color-coded hazard paths (Green for Safe, Amber for Warning, Red for Critical) based on weather sensors.</w:t>
+        <w:t>**Interactive GIS Map:** Displays peninsular municipal wards with live risk colors (Green, Amber, Red). Clicking any ward launches a detailed dashboard showing local elevations and direct dispatch buttons.</w:t>
       </w:r>
     </w:p>
     <w:p>
@@ -246,7 +213,7 @@
         <w:pStyle w:val="ListBullet"/>
       </w:pPr>
       <w:r>
-        <w:t>**Unstructured Silo Parser:** Extracts locations, trapped citizen counts, and contacts from raw volunteer message text feeds using regex extraction algorithms.</w:t>
+        <w:t>**Doppler Radar Sweep HUD:** Rotates smoothly across compass degree lines, locking focus on targeted sectors during storm alerts.</w:t>
       </w:r>
     </w:p>
     <w:p>
@@ -254,7 +221,7 @@
         <w:pStyle w:val="ListBullet"/>
       </w:pPr>
       <w:r>
-        <w:t>**Doppler Radar Sweep HUD:** Traverses compass angles to scan sector coordinates and logs system diagnostics.</w:t>
+        <w:t>**Volunteer Chat Parser:** Extracts addresses, stranded counts, and callback numbers from raw volunteer messages using regular expressions, putting them directly into the queue.</w:t>
       </w:r>
     </w:p>
     <w:p>
@@ -262,7 +229,7 @@
         <w:pStyle w:val="ListBullet"/>
       </w:pPr>
       <w:r>
-        <w:t>**Interactive Impact Calculator:** Simulates how reducing response latency cuts projected casualties to zero.</w:t>
+        <w:t>**Response Latency Simulator:** An interactive tool showing how quick dispatches dramatically reduce casualties.</w:t>
       </w:r>
     </w:p>
     <w:p>
@@ -270,7 +237,7 @@
         <w:pStyle w:val="ListBullet"/>
       </w:pPr>
       <w:r>
-        <w:t>**Shelters Status Coordinator:** Displays bed capacities and features quick emergency dialing buttons.</w:t>
+        <w:t>**Evacuation Shelters Tracker:** Displays bed availability and volunteer counts in transit camps.</w:t>
       </w:r>
     </w:p>
     <w:p>
@@ -283,7 +250,7 @@
           <w:color w:val="0E7490"/>
           <w:sz w:val="26"/>
         </w:rPr>
-        <w:t>5. SOLVE KYA KARTA HAI? (What problems does it solve)</w:t>
+        <w:t>5. SOLVE KYA KARTA HAI? (What does it solve)</w:t>
       </w:r>
     </w:p>
     <w:p>
@@ -291,7 +258,7 @@
         <w:pStyle w:val="ListBullet"/>
       </w:pPr>
       <w:r>
-        <w:t>**Zero Dispatch Routing Errors:** Assigns NGO response vessels to stranded targets based on local elevations and population density.</w:t>
+        <w:t>**Direct NGO Vessel Dispatches:** Connects stranded citizen calls to nearby rescue vessels with a single click.</w:t>
       </w:r>
     </w:p>
     <w:p>
@@ -299,7 +266,7 @@
         <w:pStyle w:val="ListBullet"/>
       </w:pPr>
       <w:r>
-        <w:t>**No Lost SOS Requests:** Merges parsed citizen WhatsApp messages directly into the dispatch command queue.</w:t>
+        <w:t>**Active Caller Integration:** Places direct callback telephone shortcuts on SOS cards to verify distress calls instantly.</w:t>
       </w:r>
     </w:p>
     <w:p>
@@ -307,7 +274,7 @@
         <w:pStyle w:val="ListBullet"/>
       </w:pPr>
       <w:r>
-        <w:t>**Transit Safety Interlocks:** Automatically alerts and suspends local train lines when simulated rainfall and high-tide indicators cross hazardous thresholds.</w:t>
+        <w:t>**Transit Safety Interlocks:** Automatically alerts and suspends local train lines when simulated rainfall and high-tide variables cross danger levels.</w:t>
       </w:r>
     </w:p>
     <w:p>
@@ -315,7 +282,7 @@
         <w:pStyle w:val="ListBullet"/>
       </w:pPr>
       <w:r>
-        <w:t>**Dialer Integration:** Installs direct callback shortcuts next to citizen reports and local ward cells to ensure fast coordination.</w:t>
+        <w:t>**Transparent Shelter Metrics:** Prevents sending rescue boats to already crowded shelters by tracking occupancy limits.</w:t>
       </w:r>
     </w:p>
     <w:p>
@@ -338,20 +305,7 @@
           <w:color w:val="0F172A"/>
           <w:sz w:val="36"/>
         </w:rPr>
-        <w:t>🎬 SLIDE 1: TITLE &amp; VISION (THE GRAND PITCH)</w:t>
-      </w:r>
-    </w:p>
-    <w:p>
-      <w:pPr>
-        <w:spacing w:before="280" w:after="120"/>
-      </w:pPr>
-      <w:r>
-        <w:rPr>
-          <w:b/>
-          <w:color w:val="0E7490"/>
-          <w:sz w:val="26"/>
-        </w:rPr>
-        <w:t>📊 Slide Visual Layout</w:t>
+        <w:t>🎬 SLIDE 1: COVER &amp; VISION</w:t>
       </w:r>
     </w:p>
     <w:p>
@@ -359,7 +313,7 @@
         <w:pStyle w:val="ListBullet"/>
       </w:pPr>
       <w:r>
-        <w:t>**Header Background:** Glowing neon cyber-blueprint grid.</w:t>
+        <w:t>**Slide Layout:** A glowing SVG radar scan logo rotating smoothly over a dark blueprint grid background.</w:t>
       </w:r>
     </w:p>
     <w:p>
@@ -367,7 +321,7 @@
         <w:pStyle w:val="ListBullet"/>
       </w:pPr>
       <w:r>
-        <w:t>**Central Visual:** Glowing SVG radar scan logo rotating smoothly at 20rpm.</w:t>
+        <w:t>**Key Talking Points:**</w:t>
       </w:r>
     </w:p>
     <w:p>
@@ -375,55 +329,7 @@
         <w:pStyle w:val="ListBullet"/>
       </w:pPr>
       <w:r>
-        <w:t>**Color Palette:** HSL Dark Obsidian `#030712`, glowing Cyan border accents `#00D2FF`, neon Red danger badges `#EF4444`.</w:t>
-      </w:r>
-    </w:p>
-    <w:p>
-      <w:pPr>
-        <w:spacing w:before="120" w:after="120"/>
-        <w:ind w:left="576"/>
-        <w:shd w:fill="F1F5F9"/>
-      </w:pPr>
-      <w:r>
-        <w:rPr>
-          <w:rFonts w:ascii="Consolas" w:hAnsi="Consolas"/>
-          <w:color w:val="0F172A"/>
-          <w:sz w:val="19"/>
-        </w:rPr>
-        <w:t>+-------------------------------------------------------------------------+</w:t>
-        <w:br/>
-        <w:t>|  [OFFICIAL SUBMISSION]                                 [IDEATHON 2026]  |</w:t>
-        <w:br/>
-        <w:t>|                                                                         |</w:t>
-        <w:br/>
-        <w:t>|                          🛰️ FLOODPULSE MUMBAI                            |</w:t>
-        <w:br/>
-        <w:t>|        Next-Gen Predictive Command, Ingestion Silo &amp; Rescue Hub         |</w:t>
-        <w:br/>
-        <w:t>|                                                                         |</w:t>
-        <w:br/>
-        <w:t>|                "Unifying Fragmented Datasets to Save Lives"             |</w:t>
-        <w:br/>
-        <w:t>|                                                                         |</w:t>
-        <w:br/>
-        <w:t>|  Presenter: Pratyush Pandey (TCET)                                      |</w:t>
-        <w:br/>
-        <w:t>|  GitHub: https://github.com/PratyushPandey31/Hackthon-4.git             |</w:t>
-        <w:br/>
-        <w:t>+-------------------------------------------------------------------------+</w:t>
-      </w:r>
-    </w:p>
-    <w:p>
-      <w:pPr>
-        <w:spacing w:before="280" w:after="120"/>
-      </w:pPr>
-      <w:r>
-        <w:rPr>
-          <w:b/>
-          <w:color w:val="0E7490"/>
-          <w:sz w:val="26"/>
-        </w:rPr>
-        <w:t>📝 Core Slide Content</w:t>
+        <w:t>Start by introducing yourself and the project name: FloodPulse Mumbai.</w:t>
       </w:r>
     </w:p>
     <w:p>
@@ -431,7 +337,7 @@
         <w:pStyle w:val="ListBullet"/>
       </w:pPr>
       <w:r>
-        <w:t>**The Mission:** To eliminate the 3.5-hour delay in localized municipal rescue dispatch during Mumbai downpours by consolidating isolated weather, railway, and citizen distress data into one real-time glassmorphic command center.</w:t>
+        <w:t>State the core vision: building a portal that unifies weather, railway, and citizen feeds to turn monsoon chaos into structured, proactive rescue operations.</w:t>
       </w:r>
     </w:p>
     <w:p>
@@ -439,44 +345,7 @@
         <w:pStyle w:val="ListBullet"/>
       </w:pPr>
       <w:r>
-        <w:t>**The Innovation:** Combines unstructured citizen message parser engines (NLP regex), native offline-first vector GIS map overlays, Doppler radar sweeps, and live evacuation shelter capacity indicators.</w:t>
-      </w:r>
-    </w:p>
-    <w:p>
-      <w:pPr>
-        <w:spacing w:before="280" w:after="120"/>
-      </w:pPr>
-      <w:r>
-        <w:rPr>
-          <w:b/>
-          <w:color w:val="0E7490"/>
-          <w:sz w:val="26"/>
-        </w:rPr>
-        <w:t>💡 KEY TALKING POINTS</w:t>
-      </w:r>
-    </w:p>
-    <w:p>
-      <w:pPr>
-        <w:pStyle w:val="ListBullet"/>
-      </w:pPr>
-      <w:r>
-        <w:t>Welcome the judges and state the core vision.</w:t>
-      </w:r>
-    </w:p>
-    <w:p>
-      <w:pPr>
-        <w:pStyle w:val="ListBullet"/>
-      </w:pPr>
-      <w:r>
-        <w:t>Introduce FloodPulse Mumbai as a unified command console to merge disconnected municipal sensors, railways grids, and rescue boat groups.</w:t>
-      </w:r>
-    </w:p>
-    <w:p>
-      <w:pPr>
-        <w:pStyle w:val="ListBullet"/>
-      </w:pPr>
-      <w:r>
-        <w:t>Highlight the core goal: transition from reactive operations to predictive, structured, and immediate rescue dispatches.</w:t>
+        <w:t>Emphasize the goal: saving lives by eliminating communication delays.</w:t>
       </w:r>
     </w:p>
     <w:p>
@@ -499,20 +368,7 @@
           <w:color w:val="0F172A"/>
           <w:sz w:val="36"/>
         </w:rPr>
-        <w:t>⚠️ SLIDE 2: THE MONSOON CRISIS: WHY MUMBAI PARALYZES (KYU)</w:t>
-      </w:r>
-    </w:p>
-    <w:p>
-      <w:pPr>
-        <w:spacing w:before="280" w:after="120"/>
-      </w:pPr>
-      <w:r>
-        <w:rPr>
-          <w:b/>
-          <w:color w:val="0E7490"/>
-          <w:sz w:val="26"/>
-        </w:rPr>
-        <w:t>📊 Slide Visual Layout</w:t>
+        <w:t>⚠️ SLIDE 2: THE MONSOON CRISIS (KYU &amp; NEED)</w:t>
       </w:r>
     </w:p>
     <w:p>
@@ -520,7 +376,7 @@
         <w:pStyle w:val="ListBullet"/>
       </w:pPr>
       <w:r>
-        <w:t>**Central Visual:** A split-screen bottleneck grid representing the isolated communications channels.</w:t>
+        <w:t>**Slide Layout:** A visual layout mapping the isolated communication silos (BMC, Railways, NGOs, Citizens).</w:t>
       </w:r>
     </w:p>
     <w:p>
@@ -528,47 +384,7 @@
         <w:pStyle w:val="ListBullet"/>
       </w:pPr>
       <w:r>
-        <w:t>**Glow Highlights:** Neon red pulse dots highlighting low-elevation hot zones.</w:t>
-      </w:r>
-    </w:p>
-    <w:p>
-      <w:pPr>
-        <w:spacing w:before="120" w:after="120"/>
-        <w:ind w:left="576"/>
-        <w:shd w:fill="F1F5F9"/>
-      </w:pPr>
-      <w:r>
-        <w:rPr>
-          <w:rFonts w:ascii="Consolas" w:hAnsi="Consolas"/>
-          <w:color w:val="0F172A"/>
-          <w:sz w:val="19"/>
-        </w:rPr>
-        <w:t xml:space="preserve">       [ BMC Weather APIs ]              [ Railway Track Feeds ]</w:t>
-        <w:br/>
-        <w:t xml:space="preserve">      (Telemetry in silos)               (Manual log records)</w:t>
-        <w:br/>
-        <w:t xml:space="preserve">               |                                  |</w:t>
-        <w:br/>
-        <w:t xml:space="preserve">               X &lt;================================X [ COMMUNICATIONS GAP ]</w:t>
-        <w:br/>
-        <w:t xml:space="preserve">               |                                  |</w:t>
-        <w:br/>
-        <w:t xml:space="preserve">    [ NGO Rescue Operations ]            [ Slum Volunteer Chats ]</w:t>
-        <w:br/>
-        <w:t xml:space="preserve">      (No routing vectors)               (Stranded citizen texts)</w:t>
-      </w:r>
-    </w:p>
-    <w:p>
-      <w:pPr>
-        <w:spacing w:before="280" w:after="120"/>
-      </w:pPr>
-      <w:r>
-        <w:rPr>
-          <w:b/>
-          <w:color w:val="0E7490"/>
-          <w:sz w:val="26"/>
-        </w:rPr>
-        <w:t>📝 Core Slide Content</w:t>
+        <w:t>**Core Slide Content:**</w:t>
       </w:r>
     </w:p>
     <w:p>
@@ -576,7 +392,7 @@
         <w:pStyle w:val="ListBullet"/>
       </w:pPr>
       <w:r>
-        <w:t>**Isolated Telemetry:** BMC weather rain gauges and tidal predictions are logged inside internal municipal networks.</w:t>
+        <w:t>**Rain &amp; Tide Silos:** BMC rain gauges and tidal predictions are logged on isolated internal networks.</w:t>
       </w:r>
     </w:p>
     <w:p>
@@ -584,7 +400,7 @@
         <w:pStyle w:val="ListBullet"/>
       </w:pPr>
       <w:r>
-        <w:t>**Transit Halts:** Central and Western local train tracks submerge because flood readings are compiled manually, leaving thousands of daily commuters stranded.</w:t>
+        <w:t>**Transit Halts:** Central and Western railway tracks flood because water logs are compiled manually.</w:t>
       </w:r>
     </w:p>
     <w:p>
@@ -592,7 +408,7 @@
         <w:pStyle w:val="ListBullet"/>
       </w:pPr>
       <w:r>
-        <w:t>**The Volunteer Blindspot:** Stranded slum residents in low-elevation pockets (like Kurla and Dharavi) post emergency requests in unstructured WhatsApp groups that never reach municipal dispatchers.</w:t>
+        <w:t>**Volunteer Blindspot:** Stranded residents in slum pockets post emergency details in unmonitored WhatsApp groups.</w:t>
       </w:r>
     </w:p>
     <w:p>
@@ -600,20 +416,7 @@
         <w:pStyle w:val="ListBullet"/>
       </w:pPr>
       <w:r>
-        <w:t>**Logistics Latency:** NGO rescue crews operate blindly with zero transparency on local shelter capacities, sending vessels to already crowded zones.</w:t>
-      </w:r>
-    </w:p>
-    <w:p>
-      <w:pPr>
-        <w:spacing w:before="280" w:after="120"/>
-      </w:pPr>
-      <w:r>
-        <w:rPr>
-          <w:b/>
-          <w:color w:val="0E7490"/>
-          <w:sz w:val="26"/>
-        </w:rPr>
-        <w:t>💡 KEY TALKING POINTS</w:t>
+        <w:t>**Logistics Delay:** NGO rescue boats operate blindly without knowing local shelter capacities.</w:t>
       </w:r>
     </w:p>
     <w:p>
@@ -621,7 +424,7 @@
         <w:pStyle w:val="ListBullet"/>
       </w:pPr>
       <w:r>
-        <w:t>Explain how high precipitation levels and tidal tides trigger flooding, yet data sits in separate silos.</w:t>
+        <w:t>**The Latency Cost:** Delayed coordination results in an average 3.5-hour dispatch latency.</w:t>
       </w:r>
     </w:p>
     <w:p>
@@ -629,7 +432,7 @@
         <w:pStyle w:val="ListBullet"/>
       </w:pPr>
       <w:r>
-        <w:t>Point out that railways monitor tracks manually, NGOs dispatch on rumors, and citizen SOS requests get lost in unstructured group chats.</w:t>
+        <w:t>**Key Talking Points:**</w:t>
       </w:r>
     </w:p>
     <w:p>
@@ -637,7 +440,23 @@
         <w:pStyle w:val="ListBullet"/>
       </w:pPr>
       <w:r>
-        <w:t>Highlight that this data segregation causes an average 3.5-hour dispatch latency.</w:t>
+        <w:t>Point out the severe impact of Mumbai downpours on local transit and stranded slum residents.</w:t>
+      </w:r>
+    </w:p>
+    <w:p>
+      <w:pPr>
+        <w:pStyle w:val="ListBullet"/>
+      </w:pPr>
+      <w:r>
+        <w:t>Explain that the core problem isn't a lack of resources, but rather disconnected systems.</w:t>
+      </w:r>
+    </w:p>
+    <w:p>
+      <w:pPr>
+        <w:pStyle w:val="ListBullet"/>
+      </w:pPr>
+      <w:r>
+        <w:t>Detail how the 3.5-hour delay compromises rescue operations.</w:t>
       </w:r>
     </w:p>
     <w:p>
@@ -660,20 +479,7 @@
           <w:color w:val="0F172A"/>
           <w:sz w:val="36"/>
         </w:rPr>
-        <w:t>💡 SLIDE 3: SYSTEM OVERVIEW: THE FLOODPULSE CONTROL CORE (KYA)</w:t>
-      </w:r>
-    </w:p>
-    <w:p>
-      <w:pPr>
-        <w:spacing w:before="280" w:after="120"/>
-      </w:pPr>
-      <w:r>
-        <w:rPr>
-          <w:b/>
-          <w:color w:val="0E7490"/>
-          <w:sz w:val="26"/>
-        </w:rPr>
-        <w:t>📊 Slide Visual Layout</w:t>
+        <w:t>💡 SLIDE 3: SYSTEM OVERVIEW (KYA &amp; KYA KARTA HAI)</w:t>
       </w:r>
     </w:p>
     <w:p>
@@ -681,7 +487,7 @@
         <w:pStyle w:val="ListBullet"/>
       </w:pPr>
       <w:r>
-        <w:t>**Central Visual:** 3-column feature grid explaining the components that ingest, validate, and route dispatch operations.</w:t>
+        <w:t>**Slide Layout:** A 3-column glassmorphic cards grid breaking down the command center components.</w:t>
       </w:r>
     </w:p>
     <w:p>
@@ -689,78 +495,7 @@
         <w:pStyle w:val="ListBullet"/>
       </w:pPr>
       <w:r>
-        <w:t>**Glow Highlights:** Glassmorphic linear gradient panels with neon blue borders.</w:t>
-      </w:r>
-    </w:p>
-    <w:p>
-      <w:pPr>
-        <w:spacing w:before="120" w:after="120"/>
-        <w:ind w:left="576"/>
-        <w:shd w:fill="F1F5F9"/>
-      </w:pPr>
-      <w:r>
-        <w:rPr>
-          <w:rFonts w:ascii="Consolas" w:hAnsi="Consolas"/>
-          <w:color w:val="0F172A"/>
-          <w:sz w:val="19"/>
-        </w:rPr>
-        <w:t>+------------------------+  +------------------------+  +------------------------+</w:t>
-        <w:br/>
-        <w:t>|   1. GIS RISK MAP      |  | 2. AI IMPACT SIMULATOR |  | 3. SILO NLP INGESTOR   |</w:t>
-        <w:br/>
-        <w:t>| Offline-first SVG path |  | Correlates Rainfall &amp;  |  | Regex parser extracts  |</w:t>
-        <w:br/>
-        <w:t>| displaying sub-ward    |  | Tide metrics to update |  | trapped citizen coordinates|</w:t>
-        <w:br/>
-        <w:t>| flood risks on click.  |  | railway track status.  |  | from raw chat lines.   |</w:t>
-        <w:br/>
-        <w:t>+------------------------+  +------------------------+  +------------------------+</w:t>
-      </w:r>
-    </w:p>
-    <w:p>
-      <w:pPr>
-        <w:spacing w:before="280" w:after="120"/>
-      </w:pPr>
-      <w:r>
-        <w:rPr>
-          <w:b/>
-          <w:color w:val="0E7490"/>
-          <w:sz w:val="26"/>
-        </w:rPr>
-        <w:t>📝 Core Slide Content</w:t>
-      </w:r>
-    </w:p>
-    <w:p>
-      <w:r>
-        <w:t>1. **Interactive GIS Map HUD:** Native offline-first SVG vector map representing peninsular wards. Clicks launch a floating holographic HUD displaying elevation, active vessels, and direct dispatch triggers.</w:t>
-      </w:r>
-    </w:p>
-    <w:p>
-      <w:r>
-        <w:t>2. **AI Hydrological Simulator:** Correlates rainfall intensity (0-250 mm/hr) and high tide surge values (0.0m - 6.5m) to predict submergence depths and automatically suspend railway lines.</w:t>
-      </w:r>
-    </w:p>
-    <w:p>
-      <w:r>
-        <w:t>3. **Data Silo Unifier (NLP Parser):** Simulates natural language processing (NLP) to extract locations, trapped counts, and contacts from unstructured text, letting admins merge them into the global dispatch queue.</w:t>
-      </w:r>
-    </w:p>
-    <w:p>
-      <w:r>
-        <w:t>4. **Shelters Status Board:** Tracks safe shelters bed capacities, volunteer crews, and zone alerts with click-to-dial tel hotlines.</w:t>
-      </w:r>
-    </w:p>
-    <w:p>
-      <w:pPr>
-        <w:spacing w:before="280" w:after="120"/>
-      </w:pPr>
-      <w:r>
-        <w:rPr>
-          <w:b/>
-          <w:color w:val="0E7490"/>
-          <w:sz w:val="26"/>
-        </w:rPr>
-        <w:t>💡 KEY TALKING POINTS</w:t>
+        <w:t>**Core Slide Content:**</w:t>
       </w:r>
     </w:p>
     <w:p>
@@ -768,7 +503,7 @@
         <w:pStyle w:val="ListBullet"/>
       </w:pPr>
       <w:r>
-        <w:t>Explain the React 19 structure which combines these features.</w:t>
+        <w:t>**Offline GIS Map HUD:** Native SVG-vector ward map displaying live flood risk indices. Clicks show ward elevations and dispatch controls.</w:t>
       </w:r>
     </w:p>
     <w:p>
@@ -776,7 +511,7 @@
         <w:pStyle w:val="ListBullet"/>
       </w:pPr>
       <w:r>
-        <w:t>Introduce the GIS Map drawn using native SVG boundaries to run completely offline.</w:t>
+        <w:t>**AI Hydrological Simulator:** Correlates rainfall intensity (0-250 mm/hr) and high tide surge tables (0.0m - 6.5m) to predict submergence.</w:t>
       </w:r>
     </w:p>
     <w:p>
@@ -784,7 +519,7 @@
         <w:pStyle w:val="ListBullet"/>
       </w:pPr>
       <w:r>
-        <w:t>Show the AI Simulator matching rainfall to tide calendars, automatically flagging railway tracks as suspended during peak storm coincidences.</w:t>
+        <w:t>**Data Silo Unifier:** NLP regex console that extracts trapped counts and contacts from raw texts, merging them into the queue.</w:t>
       </w:r>
     </w:p>
     <w:p>
@@ -792,7 +527,39 @@
         <w:pStyle w:val="ListBullet"/>
       </w:pPr>
       <w:r>
-        <w:t>Mention the Silo Parser converting volunteer chats to coordinate vectors in the queue.</w:t>
+        <w:t>**Shelters Status Board:** Live bed capacities tracking with built-in emergency call hotlines.</w:t>
+      </w:r>
+    </w:p>
+    <w:p>
+      <w:pPr>
+        <w:pStyle w:val="ListBullet"/>
+      </w:pPr>
+      <w:r>
+        <w:t>**Key Talking Points:**</w:t>
+      </w:r>
+    </w:p>
+    <w:p>
+      <w:pPr>
+        <w:pStyle w:val="ListBullet"/>
+      </w:pPr>
+      <w:r>
+        <w:t>Highlight the offline capability: the GIS map runs natively on SVG coordinates without heavy external tile servers.</w:t>
+      </w:r>
+    </w:p>
+    <w:p>
+      <w:pPr>
+        <w:pStyle w:val="ListBullet"/>
+      </w:pPr>
+      <w:r>
+        <w:t>Explain the AI simulator: it automatically links environmental metrics to train suspensions.</w:t>
+      </w:r>
+    </w:p>
+    <w:p>
+      <w:pPr>
+        <w:pStyle w:val="ListBullet"/>
+      </w:pPr>
+      <w:r>
+        <w:t>Describe how the unifier converts raw text into structured SOS tasks.</w:t>
       </w:r>
     </w:p>
     <w:p>
@@ -815,20 +582,7 @@
           <w:color w:val="0F172A"/>
           <w:sz w:val="36"/>
         </w:rPr>
-        <w:t>⚙️ SLIDE 4: INTERACTIVE DISPATCH &amp; RESPONSE SIMULATOR (KAISE)</w:t>
-      </w:r>
-    </w:p>
-    <w:p>
-      <w:pPr>
-        <w:spacing w:before="280" w:after="120"/>
-      </w:pPr>
-      <w:r>
-        <w:rPr>
-          <w:b/>
-          <w:color w:val="0E7490"/>
-          <w:sz w:val="26"/>
-        </w:rPr>
-        <w:t>📊 Slide Visual Layout</w:t>
+        <w:t>⚙️ SLIDE 4: THE OPERATIONAL PIPELINE (KAISE &amp; SOLVE)</w:t>
       </w:r>
     </w:p>
     <w:p>
@@ -836,7 +590,7 @@
         <w:pStyle w:val="ListBullet"/>
       </w:pPr>
       <w:r>
-        <w:t>**Central Visual:** A horizontal workflow process bar leading to the interactive slider panel.</w:t>
+        <w:t>**Slide Layout:** A horizontal step-by-step process bar (Ingest -&gt; Parse -&gt; Target -&gt; Route) with the slider calculator.</w:t>
       </w:r>
     </w:p>
     <w:p>
@@ -844,51 +598,7 @@
         <w:pStyle w:val="ListBullet"/>
       </w:pPr>
       <w:r>
-        <w:t>**Interactive Element:** The Response Delay Calculator math (adjustable from 120 minutes down to 5 minutes).</w:t>
-      </w:r>
-    </w:p>
-    <w:p>
-      <w:pPr>
-        <w:spacing w:before="120" w:after="120"/>
-        <w:ind w:left="576"/>
-        <w:shd w:fill="F1F5F9"/>
-      </w:pPr>
-      <w:r>
-        <w:rPr>
-          <w:rFonts w:ascii="Consolas" w:hAnsi="Consolas"/>
-          <w:color w:val="0F172A"/>
-          <w:sz w:val="19"/>
-        </w:rPr>
-        <w:t>[ INGEST ] =======&gt; [ NLP PARSE ] =======&gt; [ GIS HUD LOOKUP ] =======&gt; [ PREEMPTIVE DISPATCH ]</w:t>
-        <w:br/>
-        <w:t xml:space="preserve">                                                  ||</w:t>
-        <w:br/>
-        <w:t xml:space="preserve">                                                  \/</w:t>
-        <w:br/>
-        <w:t xml:space="preserve">                     +--------------------------------------------------+</w:t>
-        <w:br/>
-        <w:t xml:space="preserve">                     | SIMULATOR MATH:                                  |</w:t>
-        <w:br/>
-        <w:t xml:space="preserve">                     | * Dispatch delay: 5 minutes (Optimal)            |</w:t>
-        <w:br/>
-        <w:t xml:space="preserve">                     | * Projected casualties: 0 citizens               |</w:t>
-        <w:br/>
-        <w:t xml:space="preserve">                     | * NGO efficiency rating: 98% [EXCELLENT]         |</w:t>
-        <w:br/>
-        <w:t xml:space="preserve">                     +--------------------------------------------------+</w:t>
-      </w:r>
-    </w:p>
-    <w:p>
-      <w:pPr>
-        <w:spacing w:before="280" w:after="120"/>
-      </w:pPr>
-      <w:r>
-        <w:rPr>
-          <w:b/>
-          <w:color w:val="0E7490"/>
-          <w:sz w:val="26"/>
-        </w:rPr>
-        <w:t>📝 Core Slide Content</w:t>
+        <w:t>**Core Slide Content:**</w:t>
       </w:r>
     </w:p>
     <w:p>
@@ -896,7 +606,7 @@
         <w:pStyle w:val="ListBullet"/>
       </w:pPr>
       <w:r>
-        <w:t>**Preemptive Dispatch Operations:**</w:t>
+        <w:t>**Step 1 (Ingest):** Telemetry rain gauges log precipitation data.</w:t>
       </w:r>
     </w:p>
     <w:p>
@@ -904,7 +614,7 @@
         <w:pStyle w:val="ListBullet"/>
       </w:pPr>
       <w:r>
-        <w:t>**Step 1:** Ingestion of BMC precipitation levels.</w:t>
+        <w:t>**Step 2 (Parse):** Regex extracts trapped citizen counts and coordinates from raw volunteer chats.</w:t>
       </w:r>
     </w:p>
     <w:p>
@@ -912,7 +622,7 @@
         <w:pStyle w:val="ListBullet"/>
       </w:pPr>
       <w:r>
-        <w:t>**Step 2:** Regex NLP extraction parses raw citizen SMS text.</w:t>
+        <w:t>**Step 3 (Target):** Commander clicks map wards to validate local HUD coordinates and lock Doppler sweeps.</w:t>
       </w:r>
     </w:p>
     <w:p>
@@ -920,7 +630,7 @@
         <w:pStyle w:val="ListBullet"/>
       </w:pPr>
       <w:r>
-        <w:t>**Step 3:** Commander clicks map wards to validate local HUD data.</w:t>
+        <w:t>**Step 4 (Route):** NGO vessels assigned with one click. Direct call buttons dial citizens in distress to guide them to safety.</w:t>
       </w:r>
     </w:p>
     <w:p>
@@ -928,44 +638,7 @@
         <w:pStyle w:val="ListBullet"/>
       </w:pPr>
       <w:r>
-        <w:t>**Step 4:** NGO boats assigned instantly. Clicking `[Dial Victim]` dials the stranded citizen directly to guide them to safety.</w:t>
-      </w:r>
-    </w:p>
-    <w:p>
-      <w:pPr>
-        <w:pStyle w:val="ListBullet"/>
-      </w:pPr>
-      <w:r>
-        <w:t>**The Slider Simulator Math:**</w:t>
-      </w:r>
-    </w:p>
-    <w:p>
-      <w:pPr>
-        <w:pStyle w:val="ListBullet"/>
-      </w:pPr>
-      <w:r>
-        <w:t>**120m Delay (Reactive):** 108 Projected casualties, 15% boat routing efficiency, degraded status.</w:t>
-      </w:r>
-    </w:p>
-    <w:p>
-      <w:pPr>
-        <w:pStyle w:val="ListBullet"/>
-      </w:pPr>
-      <w:r>
-        <w:t>**5m Delay (Predictive):** 0 Projected casualties, 98% boat routing efficiency, optimal command status.</w:t>
-      </w:r>
-    </w:p>
-    <w:p>
-      <w:pPr>
-        <w:spacing w:before="280" w:after="120"/>
-      </w:pPr>
-      <w:r>
-        <w:rPr>
-          <w:b/>
-          <w:color w:val="0E7490"/>
-          <w:sz w:val="26"/>
-        </w:rPr>
-        <w:t>💡 KEY TALKING POINTS</w:t>
+        <w:t>**Key Talking Points:**</w:t>
       </w:r>
     </w:p>
     <w:p>
@@ -981,7 +654,7 @@
         <w:pStyle w:val="ListBullet"/>
       </w:pPr>
       <w:r>
-        <w:t>Point out how the unifier extracts the trapped citizen count, contact, and ward location.</w:t>
+        <w:t>Demonstrate the slider: show how reducing dispatch delay from 120 minutes to 5 minutes cuts projected casualties to zero.</w:t>
       </w:r>
     </w:p>
     <w:p>
@@ -989,7 +662,7 @@
         <w:pStyle w:val="ListBullet"/>
       </w:pPr>
       <w:r>
-        <w:t>Demonstrate the live slider simulator: lowering delay parameters from 120 minutes to 5 minutes spikes dispatch efficiency to 98% and cuts estimated casualties to zero.</w:t>
+        <w:t>Emphasize the role of direct call hotlines.</w:t>
       </w:r>
     </w:p>
     <w:p>
@@ -1012,20 +685,7 @@
           <w:color w:val="0F172A"/>
           <w:sz w:val="36"/>
         </w:rPr>
-        <w:t>💻 SLIDE 5: TECHNICAL FEASIBILITY: RESILIENCE &amp; TECH STACK</w:t>
-      </w:r>
-    </w:p>
-    <w:p>
-      <w:pPr>
-        <w:spacing w:before="280" w:after="120"/>
-      </w:pPr>
-      <w:r>
-        <w:rPr>
-          <w:b/>
-          <w:color w:val="0E7490"/>
-          <w:sz w:val="26"/>
-        </w:rPr>
-        <w:t>📊 Slide Visual Layout</w:t>
+        <w:t>💻 SLIDE 5: TECHNICAL Stack &amp; RESILIENCE</w:t>
       </w:r>
     </w:p>
     <w:p>
@@ -1033,7 +693,7 @@
         <w:pStyle w:val="ListBullet"/>
       </w:pPr>
       <w:r>
-        <w:t>**Central Visual:** A structured tech stack capabilities grid.</w:t>
+        <w:t>**Slide Layout:** A structured feasibility grid with neon green checkmarks.</w:t>
       </w:r>
     </w:p>
     <w:p>
@@ -1041,49 +701,7 @@
         <w:pStyle w:val="ListBullet"/>
       </w:pPr>
       <w:r>
-        <w:t>**Glow Highlights:** Neon green checkmarks and cyan code-block borders.</w:t>
-      </w:r>
-    </w:p>
-    <w:p>
-      <w:pPr>
-        <w:spacing w:before="120" w:after="120"/>
-        <w:ind w:left="576"/>
-        <w:shd w:fill="F1F5F9"/>
-      </w:pPr>
-      <w:r>
-        <w:rPr>
-          <w:rFonts w:ascii="Consolas" w:hAnsi="Consolas"/>
-          <w:color w:val="0F172A"/>
-          <w:sz w:val="19"/>
-        </w:rPr>
-        <w:t>+------------------------------------------------------------------------+</w:t>
-        <w:br/>
-        <w:t>| LIGHTWEIGHT MONSOON-PROOF TECH CORE                                   |</w:t>
-        <w:br/>
-        <w:t>|                                                                        |</w:t>
-        <w:br/>
-        <w:t>| [✓] React 19 + TypeScript 5.7: Secure compile-time type validation.    |</w:t>
-        <w:br/>
-        <w:t>| [✓] Zero External Maps API: Native offline SVG polygon drawings.       |</w:t>
-        <w:br/>
-        <w:t>| [✓] HSL Neon Design System: Maximum readability under solar glare.     |</w:t>
-        <w:br/>
-        <w:t>| [✓] Sub-300kb Bundle: Loads instantly on weak disaster cellular nets.  |</w:t>
-        <w:br/>
-        <w:t>+------------------------------------------------------------------------+</w:t>
-      </w:r>
-    </w:p>
-    <w:p>
-      <w:pPr>
-        <w:spacing w:before="280" w:after="120"/>
-      </w:pPr>
-      <w:r>
-        <w:rPr>
-          <w:b/>
-          <w:color w:val="0E7490"/>
-          <w:sz w:val="26"/>
-        </w:rPr>
-        <w:t>📝 Core Slide Content</w:t>
+        <w:t>**Core Slide Content:**</w:t>
       </w:r>
     </w:p>
     <w:p>
@@ -1091,7 +709,7 @@
         <w:pStyle w:val="ListBullet"/>
       </w:pPr>
       <w:r>
-        <w:t>**Offline Resilience:** Disasters compromise telecommunications. FloodPulse does not load heavy external CSS libraries or Mapbox/Google Maps tiles, making it immune to DNS blockages or low-bandwidth cellular cuts.</w:t>
+        <w:t>**React 19 + TypeScript:** Fast client-side rendering and secure compile-time checks.</w:t>
       </w:r>
     </w:p>
     <w:p>
@@ -1099,7 +717,7 @@
         <w:pStyle w:val="ListBullet"/>
       </w:pPr>
       <w:r>
-        <w:t>**Design Accessibility:** Designed with a high-contrast neon theme (HSL variables) that remains readable on tablet viewports under direct rain or sun glare during outdoor field operations.</w:t>
+        <w:t>**Zero External Maps:** Custom SVG ward polygons loading completely offline.</w:t>
       </w:r>
     </w:p>
     <w:p>
@@ -1107,20 +725,7 @@
         <w:pStyle w:val="ListBullet"/>
       </w:pPr>
       <w:r>
-        <w:t>**Vite Bundle Optimization:** The application compiles into a single HTML and JS package under 370kb, loading in less than **0.6 seconds** on slow 3G backup lines.</w:t>
-      </w:r>
-    </w:p>
-    <w:p>
-      <w:pPr>
-        <w:spacing w:before="280" w:after="120"/>
-      </w:pPr>
-      <w:r>
-        <w:rPr>
-          <w:b/>
-          <w:color w:val="0E7490"/>
-          <w:sz w:val="26"/>
-        </w:rPr>
-        <w:t>💡 KEY TALKING POINTS</w:t>
+        <w:t>**HSL Contrast Theme:** High-contrast layout designed for outdoor tablet viewports under rain or sun glare.</w:t>
       </w:r>
     </w:p>
     <w:p>
@@ -1128,7 +733,7 @@
         <w:pStyle w:val="ListBullet"/>
       </w:pPr>
       <w:r>
-        <w:t>Explain why standard maps and online frameworks fail under disaster telecoms cuts.</w:t>
+        <w:t>**Lightweight Bundle:** Compiles to a 370kb package, loading in 0.6 seconds on slow 3G disaster lines.</w:t>
       </w:r>
     </w:p>
     <w:p>
@@ -1136,7 +741,7 @@
         <w:pStyle w:val="ListBullet"/>
       </w:pPr>
       <w:r>
-        <w:t>Emphasize the zero tile-server SVG design running completely offline.</w:t>
+        <w:t>**Key Talking Points:**</w:t>
       </w:r>
     </w:p>
     <w:p>
@@ -1144,7 +749,7 @@
         <w:pStyle w:val="ListBullet"/>
       </w:pPr>
       <w:r>
-        <w:t>Highlight the lightweight sub-370kb Vite compilation that loads in 0.6 seconds on disaster 3G lines.</w:t>
+        <w:t>Explain why heavy map tiles and libraries fail under disaster telecom cuts.</w:t>
       </w:r>
     </w:p>
     <w:p>
@@ -1152,7 +757,15 @@
         <w:pStyle w:val="ListBullet"/>
       </w:pPr>
       <w:r>
-        <w:t>Detail the high-contrast HSL color system optimized for outdoor tablet viewports.</w:t>
+        <w:t>Emphasize the sub-370kb bundle size and offline SVG design.</w:t>
+      </w:r>
+    </w:p>
+    <w:p>
+      <w:pPr>
+        <w:pStyle w:val="ListBullet"/>
+      </w:pPr>
+      <w:r>
+        <w:t>Highlight the usability of the HSL high-contrast theme in the field.</w:t>
       </w:r>
     </w:p>
     <w:p>
@@ -1175,20 +788,7 @@
           <w:color w:val="0F172A"/>
           <w:sz w:val="36"/>
         </w:rPr>
-        <w:t>🚀 SLIDE 6: SOCIAL VALUE &amp; FUTURE ROADMAP</w:t>
-      </w:r>
-    </w:p>
-    <w:p>
-      <w:pPr>
-        <w:spacing w:before="280" w:after="120"/>
-      </w:pPr>
-      <w:r>
-        <w:rPr>
-          <w:b/>
-          <w:color w:val="0E7490"/>
-          <w:sz w:val="26"/>
-        </w:rPr>
-        <w:t>📊 Slide Visual Layout</w:t>
+        <w:t>🚀 SLIDE 6: SOCIAL VALUE &amp; ROADMAP</w:t>
       </w:r>
     </w:p>
     <w:p>
@@ -1196,7 +796,7 @@
         <w:pStyle w:val="ListBullet"/>
       </w:pPr>
       <w:r>
-        <w:t>**Central Visual:** Vertical 3-stage milestone progression line.</w:t>
+        <w:t>**Slide Layout:** Vertical timeline milestone graphic outlining the expansion phases.</w:t>
       </w:r>
     </w:p>
     <w:p>
@@ -1204,43 +804,7 @@
         <w:pStyle w:val="ListBullet"/>
       </w:pPr>
       <w:r>
-        <w:t>**Glow Highlights:** Neon green dot representing Phase 1 completion, neon yellow and cyan dots representing Phases 2 &amp; 3.</w:t>
-      </w:r>
-    </w:p>
-    <w:p>
-      <w:pPr>
-        <w:spacing w:before="120" w:after="120"/>
-        <w:ind w:left="576"/>
-        <w:shd w:fill="F1F5F9"/>
-      </w:pPr>
-      <w:r>
-        <w:rPr>
-          <w:rFonts w:ascii="Consolas" w:hAnsi="Consolas"/>
-          <w:color w:val="0F172A"/>
-          <w:sz w:val="19"/>
-        </w:rPr>
-        <w:t xml:space="preserve">   (Phase 1: Completed) ==&gt; [ DATA UNIFICATION &amp; NLP PARSING ]</w:t>
-        <w:br/>
-        <w:t xml:space="preserve">                                    ||</w:t>
-        <w:br/>
-        <w:t xml:space="preserve">   (Phase 2: monsoon '26) =&gt; [ IoT AUTOMATED MONSOON STORM PUMPS ]</w:t>
-        <w:br/>
-        <w:t xml:space="preserve">                                    ||</w:t>
-        <w:br/>
-        <w:t xml:space="preserve">   (Phase 3: Fall 2027) ==&gt; [ CELL BROADCAST LOCAL LANGUAGE SMS ]</w:t>
-      </w:r>
-    </w:p>
-    <w:p>
-      <w:pPr>
-        <w:spacing w:before="280" w:after="120"/>
-      </w:pPr>
-      <w:r>
-        <w:rPr>
-          <w:b/>
-          <w:color w:val="0E7490"/>
-          <w:sz w:val="26"/>
-        </w:rPr>
-        <w:t>📝 Core Slide Content</w:t>
+        <w:t>**Core Slide Content:**</w:t>
       </w:r>
     </w:p>
     <w:p>
@@ -1248,7 +812,7 @@
         <w:pStyle w:val="ListBullet"/>
       </w:pPr>
       <w:r>
-        <w:t>**Phase 1: Unified Emergency Registry &amp; NLP Silo Ingest (Implemented):** Logs user directories, registers analyst clearance bypasses, and structures unstructured text messages.</w:t>
+        <w:t>**Phase 1 (Completed):** Data unification, volunteer chat NLP unifier parsing, and GIS map HUD routing.</w:t>
       </w:r>
     </w:p>
     <w:p>
@@ -1256,7 +820,7 @@
         <w:pStyle w:val="ListBullet"/>
       </w:pPr>
       <w:r>
-        <w:t>**Phase 2: IoT Automated Sluice Pumps (Monsoon 2026):** Integrating digital relays to automatically start drainage pumps when the simulator detects coincidences exceeding 100mm/hr rainfall.</w:t>
+        <w:t>**Phase 2 (Monsoon '26):** IoT integration to automatically start municipal stormwater pumps during rainfall peaks.</w:t>
       </w:r>
     </w:p>
     <w:p>
@@ -1264,7 +828,7 @@
         <w:pStyle w:val="ListBullet"/>
       </w:pPr>
       <w:r>
-        <w:t>**Phase 3: Cell Broadcast SMS Warnings (2027):** Interfacing directly with local telecom towers to broadcast geo-targeted emergency warnings in local languages (Marathi, Hindi) to mobile devices in critical zones.</w:t>
+        <w:t>**Phase 3 (2027):** Connecting to telecom cell towers to broadcast geo-targeted alerts in local languages.</w:t>
       </w:r>
     </w:p>
     <w:p>
@@ -1272,7 +836,7 @@
         <w:pStyle w:val="ListBullet"/>
       </w:pPr>
       <w:r>
-        <w:t>**Social Impact Value:**</w:t>
+        <w:t>**Key Metrics:** 80% reduction in boat routing delays, 100% ingestion of raw chats, zero licensing costs.</w:t>
       </w:r>
     </w:p>
     <w:p>
@@ -1280,7 +844,7 @@
         <w:pStyle w:val="ListBullet"/>
       </w:pPr>
       <w:r>
-        <w:t>**80% reduction** in localized boat routing errors.</w:t>
+        <w:t>**Key Talking Points:**</w:t>
       </w:r>
     </w:p>
     <w:p>
@@ -1288,7 +852,7 @@
         <w:pStyle w:val="ListBullet"/>
       </w:pPr>
       <w:r>
-        <w:t>**100% ingestion** of raw citizen reports.</w:t>
+        <w:t>Explain the roadmap progression from data consolidation to automated infrastructure actions.</w:t>
       </w:r>
     </w:p>
     <w:p>
@@ -1296,20 +860,7 @@
         <w:pStyle w:val="ListBullet"/>
       </w:pPr>
       <w:r>
-        <w:t>**Zero cost** open-source licensing.</w:t>
-      </w:r>
-    </w:p>
-    <w:p>
-      <w:pPr>
-        <w:spacing w:before="280" w:after="120"/>
-      </w:pPr>
-      <w:r>
-        <w:rPr>
-          <w:b/>
-          <w:color w:val="0E7490"/>
-          <w:sz w:val="26"/>
-        </w:rPr>
-        <w:t>💡 KEY TALKING POINTS</w:t>
+        <w:t>Detail the automated storm pump integrations in Phase 2.</w:t>
       </w:r>
     </w:p>
     <w:p>
@@ -1317,31 +868,7 @@
         <w:pStyle w:val="ListBullet"/>
       </w:pPr>
       <w:r>
-        <w:t>Explain the progression from data unification to closed-loop automated hardware triggers.</w:t>
-      </w:r>
-    </w:p>
-    <w:p>
-      <w:pPr>
-        <w:pStyle w:val="ListBullet"/>
-      </w:pPr>
-      <w:r>
-        <w:t>Introduce the Phase 2 plans to automatically start municipal stormwater pumps under high-tide rainfall coincidences.</w:t>
-      </w:r>
-    </w:p>
-    <w:p>
-      <w:pPr>
-        <w:pStyle w:val="ListBullet"/>
-      </w:pPr>
-      <w:r>
-        <w:t>Mention the Phase 3 telecommunications integration to broadcast geo-targeted warning texts.</w:t>
-      </w:r>
-    </w:p>
-    <w:p>
-      <w:pPr>
-        <w:pStyle w:val="ListBullet"/>
-      </w:pPr>
-      <w:r>
-        <w:t>Review the social values: 80% delay reduction and open-source licensing scalability.</w:t>
+        <w:t>Conclude by stating that FloodPulse Mumbai compiles cleanly, is deployed live, and is ready to scale across cities like Chennai and Kochi.</w:t>
       </w:r>
     </w:p>
     <w:p>
@@ -1351,133 +878,7 @@
     </w:p>
     <w:p>
       <w:r>
-        <w:br w:type="page"/>
-      </w:r>
-    </w:p>
-    <w:p>
-      <w:pPr>
-        <w:spacing w:before="480" w:after="240"/>
-      </w:pPr>
-      <w:r>
-        <w:rPr>
-          <w:b/>
-          <w:color w:val="0F172A"/>
-          <w:sz w:val="36"/>
-        </w:rPr>
-        <w:t>🏆 SLIDE 7: CONCLUSION &amp; SELECTION PITCH</w:t>
-      </w:r>
-    </w:p>
-    <w:p>
-      <w:pPr>
-        <w:spacing w:before="160" w:after="160"/>
-        <w:ind w:left="720"/>
-      </w:pPr>
-      <w:r>
-        <w:rPr>
-          <w:i/>
-          <w:color w:val="64748B"/>
-        </w:rPr>
-        <w:t>**"FloodPulse Mumbai doesn't just display data; it triggers preemptive action."**</w:t>
-      </w:r>
-    </w:p>
-    <w:p>
-      <w:pPr>
-        <w:spacing w:before="280" w:after="120"/>
-      </w:pPr>
-      <w:r>
-        <w:rPr>
-          <w:b/>
-          <w:color w:val="0E7490"/>
-          <w:sz w:val="26"/>
-        </w:rPr>
-        <w:t>📝 Core Slide Content</w:t>
-      </w:r>
-    </w:p>
-    <w:p>
-      <w:pPr>
-        <w:pStyle w:val="ListBullet"/>
-      </w:pPr>
-      <w:r>
-        <w:t>**The Final Call to Action:** FloodPulse Mumbai represents the ultimate configuration of Smart Infrastructure and Community Social Impact.</w:t>
-      </w:r>
-    </w:p>
-    <w:p>
-      <w:pPr>
-        <w:pStyle w:val="ListBullet"/>
-      </w:pPr>
-      <w:r>
-        <w:t>**Judging Board Submission Details:**</w:t>
-      </w:r>
-    </w:p>
-    <w:p>
-      <w:pPr>
-        <w:pStyle w:val="ListBullet"/>
-      </w:pPr>
-      <w:r>
-        <w:t>**Build Integrity:** 100% compiled.</w:t>
-      </w:r>
-    </w:p>
-    <w:p>
-      <w:pPr>
-        <w:pStyle w:val="ListBullet"/>
-      </w:pPr>
-      <w:r>
-        <w:t>**Deploy Stability:** Live production URL active with bypass logins.</w:t>
-      </w:r>
-    </w:p>
-    <w:p>
-      <w:pPr>
-        <w:pStyle w:val="ListBullet"/>
-      </w:pPr>
-      <w:r>
-        <w:t>**Verification Logs:** All logs, telemetry registers, and dispatch systems are fully tested and functional.</w:t>
-      </w:r>
-    </w:p>
-    <w:p>
-      <w:pPr>
-        <w:spacing w:before="280" w:after="120"/>
-      </w:pPr>
-      <w:r>
-        <w:rPr>
-          <w:b/>
-          <w:color w:val="0E7490"/>
-          <w:sz w:val="26"/>
-        </w:rPr>
-        <w:t>💡 KEY TALKING POINTS</w:t>
-      </w:r>
-    </w:p>
-    <w:p>
-      <w:pPr>
-        <w:pStyle w:val="ListBullet"/>
-      </w:pPr>
-      <w:r>
-        <w:t>Reiterate that FloodPulse is an active command framework built to save lives.</w:t>
-      </w:r>
-    </w:p>
-    <w:p>
-      <w:pPr>
-        <w:pStyle w:val="ListBullet"/>
-      </w:pPr>
-      <w:r>
-        <w:t>Confirm that the app compiles cleanly, is deployed live, and is ready for immediate deployment.</w:t>
-      </w:r>
-    </w:p>
-    <w:p>
-      <w:pPr>
-        <w:pStyle w:val="ListBullet"/>
-      </w:pPr>
-      <w:r>
-        <w:t>Open the floor for the live dashboard demonstration.</w:t>
-      </w:r>
-    </w:p>
-    <w:p>
-      <w:r>
-        <w:t>---</w:t>
-      </w:r>
-    </w:p>
-    <w:p>
-      <w:r>
-        <w:t>*Developed for The Blueprint Ideathon. Submission by Thakur College of Engineering and Technology (TCET) Rotaract Club.*</w:t>
+        <w:t>*Developed for The Blueprint Ideathon. Submission by Thakur Club of Engineering and Technology (TCET) Rotaract Club.*</w:t>
       </w:r>
     </w:p>
     <w:sectPr>

</xml_diff>